<commit_message>
Sample .docx headings look like headings
Verifying the mock documents on the deployed code: the Word file rendered,
but every heading came out the same size as the sentence under it, so a
page of scoping questions read as one wall of text.

A style id alone leaves the rendering to whatever opens the file. Bold and
a point size on the run itself survive any renderer, so the title, "The
portfolio", "The notified body", "The team" and "Timing" now read as
sections in the hover card and the viewer both.

Generator change plus the regenerated file. Not deployed — the yes covered
8616dad.
</commit_message>
<xml_diff>
--- a/public/sample-documents/eu-mdr-discovery-questions.docx
+++ b/public/sample-documents/eu-mdr-discovery-questions.docx
@@ -5,12 +5,20 @@
     <w:p>
       <w:pPr>
         <w:pStyle w:val="Title"/>
+        <w:spacing w:after="240"/>
       </w:pPr>
       <w:r>
+        <w:rPr>
+          <w:b/>
+          <w:sz w:val="40"/>
+        </w:rPr>
         <w:t xml:space="preserve">EU MDR — discovery questions</w:t>
       </w:r>
     </w:p>
     <w:p>
+      <w:pPr>
+        <w:spacing w:after="120"/>
+      </w:pPr>
       <w:r>
         <w:t xml:space="preserve">Aether Medical Devices · scoping call. This is a listening meeting: ask, do not pitch.</w:t>
       </w:r>
@@ -18,22 +26,36 @@
     <w:p>
       <w:pPr>
         <w:pStyle w:val="Heading1"/>
+        <w:spacing w:before="280" w:after="120"/>
       </w:pPr>
       <w:r>
+        <w:rPr>
+          <w:b/>
+          <w:sz w:val="28"/>
+        </w:rPr>
         <w:t xml:space="preserve">The portfolio</w:t>
       </w:r>
     </w:p>
     <w:p>
+      <w:pPr>
+        <w:spacing w:after="120"/>
+      </w:pPr>
       <w:r>
         <w:t xml:space="preserve">How many devices are in scope, and how many change class under the new rules?</w:t>
       </w:r>
     </w:p>
     <w:p>
+      <w:pPr>
+        <w:spacing w:after="120"/>
+      </w:pPr>
       <w:r>
         <w:t xml:space="preserve">Which of them are legacy devices still on an MDD certificate?</w:t>
       </w:r>
     </w:p>
     <w:p>
+      <w:pPr>
+        <w:spacing w:after="120"/>
+      </w:pPr>
       <w:r>
         <w:t xml:space="preserve">What is the revenue behind the three largest, and does any of it stop if a certificate lapses?</w:t>
       </w:r>
@@ -41,22 +63,36 @@
     <w:p>
       <w:pPr>
         <w:pStyle w:val="Heading1"/>
+        <w:spacing w:before="280" w:after="120"/>
       </w:pPr>
       <w:r>
+        <w:rPr>
+          <w:b/>
+          <w:sz w:val="28"/>
+        </w:rPr>
         <w:t xml:space="preserve">The notified body</w:t>
       </w:r>
     </w:p>
     <w:p>
+      <w:pPr>
+        <w:spacing w:after="120"/>
+      </w:pPr>
       <w:r>
         <w:t xml:space="preserve">Which notified body, and is a review slot already booked?</w:t>
       </w:r>
     </w:p>
     <w:p>
+      <w:pPr>
+        <w:spacing w:after="120"/>
+      </w:pPr>
       <w:r>
         <w:t xml:space="preserve">What did they say about the current technical documentation?</w:t>
       </w:r>
     </w:p>
     <w:p>
+      <w:pPr>
+        <w:spacing w:after="120"/>
+      </w:pPr>
       <w:r>
         <w:t xml:space="preserve">Has anything come back as a non-conformity, and is it closed?</w:t>
       </w:r>
@@ -64,22 +100,36 @@
     <w:p>
       <w:pPr>
         <w:pStyle w:val="Heading1"/>
+        <w:spacing w:before="280" w:after="120"/>
       </w:pPr>
       <w:r>
+        <w:rPr>
+          <w:b/>
+          <w:sz w:val="28"/>
+        </w:rPr>
         <w:t xml:space="preserve">The team</w:t>
       </w:r>
     </w:p>
     <w:p>
+      <w:pPr>
+        <w:spacing w:after="120"/>
+      </w:pPr>
       <w:r>
         <w:t xml:space="preserve">Who writes the technical files today, and how many of them are there?</w:t>
       </w:r>
     </w:p>
     <w:p>
+      <w:pPr>
+        <w:spacing w:after="120"/>
+      </w:pPr>
       <w:r>
         <w:t xml:space="preserve">Who signs them off, and how long does that take?</w:t>
       </w:r>
     </w:p>
     <w:p>
+      <w:pPr>
+        <w:spacing w:after="120"/>
+      </w:pPr>
       <w:r>
         <w:t xml:space="preserve">What has already been outsourced, and how did it go?</w:t>
       </w:r>
@@ -87,22 +137,36 @@
     <w:p>
       <w:pPr>
         <w:pStyle w:val="Heading1"/>
+        <w:spacing w:before="280" w:after="120"/>
       </w:pPr>
       <w:r>
+        <w:rPr>
+          <w:b/>
+          <w:sz w:val="28"/>
+        </w:rPr>
         <w:t xml:space="preserve">Timing</w:t>
       </w:r>
     </w:p>
     <w:p>
+      <w:pPr>
+        <w:spacing w:after="120"/>
+      </w:pPr>
       <w:r>
         <w:t xml:space="preserve">What is the first hard date, and what happens on the day it is missed?</w:t>
       </w:r>
     </w:p>
     <w:p>
+      <w:pPr>
+        <w:spacing w:after="120"/>
+      </w:pPr>
       <w:r>
         <w:t xml:space="preserve">Is there budget allocated this year, or is this next year's problem?</w:t>
       </w:r>
     </w:p>
     <w:p>
+      <w:pPr>
+        <w:spacing w:after="120"/>
+      </w:pPr>
       <w:r>
         <w:t xml:space="preserve">Freyr Solutions · sample document · the companies named here are fictional</w:t>
       </w:r>

</xml_diff>